<commit_message>
Ship a static production build with security headers and less dead weight.
Keep the live intro and portfolio markup unchanged; drop unused prototype files, cache only successful SW responses, and deploy from dist/ only.

Co-authored-by: Cursor <cursoragent@cursor.com>
</commit_message>
<xml_diff>
--- a/dist/Harshit_Resume.docx
+++ b/dist/Harshit_Resume.docx
@@ -50,7 +50,6 @@
         <w:t xml:space="preserve">  •  </w:t>
       </w:r>
       <w:hyperlink r:id="rId6" w:history="1">
-        <w:proofErr w:type="spellStart"/>
         <w:r>
           <w:rPr>
             <w:rStyle w:val="Hyperlink"/>
@@ -60,7 +59,6 @@
           </w:rPr>
           <w:t>harshh.pages.dev</w:t>
         </w:r>
-        <w:proofErr w:type="spellEnd"/>
       </w:hyperlink>
       <w:r>
         <w:rPr>
@@ -217,7 +215,6 @@
           <w:szCs w:val="20"/>
         </w:rPr>
       </w:pPr>
-      <w:proofErr w:type="spellStart"/>
       <w:r>
         <w:rPr>
           <w:rFonts w:asciiTheme="minorHAnsi" w:hAnsiTheme="minorHAnsi" w:cstheme="minorHAnsi"/>
@@ -228,7 +225,6 @@
         </w:rPr>
         <w:t>GetCited</w:t>
       </w:r>
-      <w:proofErr w:type="spellEnd"/>
       <w:r>
         <w:rPr>
           <w:rFonts w:asciiTheme="minorHAnsi" w:hAnsiTheme="minorHAnsi" w:cstheme="minorHAnsi"/>
@@ -245,19 +241,8 @@
             <w:sz w:val="20"/>
             <w:szCs w:val="20"/>
           </w:rPr>
-          <w:t>github.com/harsh4k/</w:t>
+          <w:t>github.com/harsh4k/Getcited</w:t>
         </w:r>
-        <w:proofErr w:type="spellStart"/>
-        <w:r>
-          <w:rPr>
-            <w:rStyle w:val="Hyperlink"/>
-            <w:rFonts w:asciiTheme="minorHAnsi" w:hAnsiTheme="minorHAnsi" w:cstheme="minorHAnsi"/>
-            <w:sz w:val="20"/>
-            <w:szCs w:val="20"/>
-          </w:rPr>
-          <w:t>Getcited</w:t>
-        </w:r>
-        <w:proofErr w:type="spellEnd"/>
       </w:hyperlink>
     </w:p>
     <w:p>
@@ -310,25 +295,7 @@
           <w:sz w:val="20"/>
           <w:szCs w:val="20"/>
         </w:rPr>
-        <w:t xml:space="preserve">1st at </w:t>
-      </w:r>
-      <w:proofErr w:type="spellStart"/>
-      <w:r>
-        <w:rPr>
-          <w:rFonts w:asciiTheme="minorHAnsi" w:hAnsiTheme="minorHAnsi" w:cstheme="minorHAnsi"/>
-          <w:sz w:val="20"/>
-          <w:szCs w:val="20"/>
-        </w:rPr>
-        <w:t>NamasteDev</w:t>
-      </w:r>
-      <w:proofErr w:type="spellEnd"/>
-      <w:r>
-        <w:rPr>
-          <w:rFonts w:asciiTheme="minorHAnsi" w:hAnsiTheme="minorHAnsi" w:cstheme="minorHAnsi"/>
-          <w:sz w:val="20"/>
-          <w:szCs w:val="20"/>
-        </w:rPr>
-        <w:t xml:space="preserve"> Hackathon 2026; AEO/GEO platform that scores how likely 5 assistants (ChatGPT, Gemini, Claude, Perplexity, Copilot) are to cite a site.</w:t>
+        <w:t>1st at NamasteDev Hackathon 2026; AEO/GEO platform that scores how likely 5 assistants (ChatGPT, Gemini, Claude, Perplexity, Copilot) are to cite a site.</w:t>
       </w:r>
     </w:p>
     <w:p>
@@ -360,43 +327,7 @@
           <w:sz w:val="20"/>
           <w:szCs w:val="20"/>
         </w:rPr>
-        <w:t xml:space="preserve">Next.js + </w:t>
-      </w:r>
-      <w:proofErr w:type="spellStart"/>
-      <w:r>
-        <w:rPr>
-          <w:rFonts w:asciiTheme="minorHAnsi" w:hAnsiTheme="minorHAnsi" w:cstheme="minorHAnsi"/>
-          <w:sz w:val="20"/>
-          <w:szCs w:val="20"/>
-        </w:rPr>
-        <w:t>Supabase</w:t>
-      </w:r>
-      <w:proofErr w:type="spellEnd"/>
-      <w:r>
-        <w:rPr>
-          <w:rFonts w:asciiTheme="minorHAnsi" w:hAnsiTheme="minorHAnsi" w:cstheme="minorHAnsi"/>
-          <w:sz w:val="20"/>
-          <w:szCs w:val="20"/>
-        </w:rPr>
-        <w:t xml:space="preserve"> crawls return 2 scores and a prioritized fix list across 5 layers (metadata, schema, HTML, crawlability, structured data), plus CLIP + </w:t>
-      </w:r>
-      <w:proofErr w:type="spellStart"/>
-      <w:r>
-        <w:rPr>
-          <w:rFonts w:asciiTheme="minorHAnsi" w:hAnsiTheme="minorHAnsi" w:cstheme="minorHAnsi"/>
-          <w:sz w:val="20"/>
-          <w:szCs w:val="20"/>
-        </w:rPr>
-        <w:t>DeepGaze</w:t>
-      </w:r>
-      <w:proofErr w:type="spellEnd"/>
-      <w:r>
-        <w:rPr>
-          <w:rFonts w:asciiTheme="minorHAnsi" w:hAnsiTheme="minorHAnsi" w:cstheme="minorHAnsi"/>
-          <w:sz w:val="20"/>
-          <w:szCs w:val="20"/>
-        </w:rPr>
-        <w:t xml:space="preserve"> saliency.</w:t>
+        <w:t>Next.js + Supabase crawls return 2 scores and a prioritized fix list across 5 layers (metadata, schema, HTML, crawlability, structured data), plus CLIP + DeepGaze saliency.</w:t>
       </w:r>
     </w:p>
     <w:p>
@@ -521,25 +452,7 @@
           <w:sz w:val="20"/>
           <w:szCs w:val="20"/>
         </w:rPr>
-        <w:t>100% local inference (</w:t>
-      </w:r>
-      <w:proofErr w:type="spellStart"/>
-      <w:r>
-        <w:rPr>
-          <w:rFonts w:asciiTheme="minorHAnsi" w:hAnsiTheme="minorHAnsi" w:cstheme="minorHAnsi"/>
-          <w:sz w:val="20"/>
-          <w:szCs w:val="20"/>
-        </w:rPr>
-        <w:t>Ollama</w:t>
-      </w:r>
-      <w:proofErr w:type="spellEnd"/>
-      <w:r>
-        <w:rPr>
-          <w:rFonts w:asciiTheme="minorHAnsi" w:hAnsiTheme="minorHAnsi" w:cstheme="minorHAnsi"/>
-          <w:sz w:val="20"/>
-          <w:szCs w:val="20"/>
-        </w:rPr>
-        <w:t xml:space="preserve"> + faster-whisper) with 0 cloud APIs/telemetry; risky actions need on-screen confirmation.</w:t>
+        <w:t>100% local inference (Ollama + faster-whisper) with 0 cloud APIs/telemetry; risky actions need on-screen confirmation.</w:t>
       </w:r>
     </w:p>
     <w:p>
@@ -552,7 +465,6 @@
           <w:szCs w:val="20"/>
         </w:rPr>
       </w:pPr>
-      <w:proofErr w:type="spellStart"/>
       <w:r>
         <w:rPr>
           <w:rFonts w:asciiTheme="minorHAnsi" w:hAnsiTheme="minorHAnsi" w:cstheme="minorHAnsi"/>
@@ -563,7 +475,6 @@
         </w:rPr>
         <w:t>Attendo</w:t>
       </w:r>
-      <w:proofErr w:type="spellEnd"/>
       <w:r>
         <w:rPr>
           <w:rFonts w:asciiTheme="minorHAnsi" w:hAnsiTheme="minorHAnsi" w:cstheme="minorHAnsi"/>
@@ -666,25 +577,7 @@
           <w:sz w:val="20"/>
           <w:szCs w:val="20"/>
         </w:rPr>
-        <w:t>Lectures tracked across 4 states (scheduled to cancelled) with present/absent marking and Zod-validated React/</w:t>
-      </w:r>
-      <w:proofErr w:type="spellStart"/>
-      <w:r>
-        <w:rPr>
-          <w:rFonts w:asciiTheme="minorHAnsi" w:hAnsiTheme="minorHAnsi" w:cstheme="minorHAnsi"/>
-          <w:sz w:val="20"/>
-          <w:szCs w:val="20"/>
-        </w:rPr>
-        <w:t>TanStack</w:t>
-      </w:r>
-      <w:proofErr w:type="spellEnd"/>
-      <w:r>
-        <w:rPr>
-          <w:rFonts w:asciiTheme="minorHAnsi" w:hAnsiTheme="minorHAnsi" w:cstheme="minorHAnsi"/>
-          <w:sz w:val="20"/>
-          <w:szCs w:val="20"/>
-        </w:rPr>
-        <w:t xml:space="preserve"> forms.</w:t>
+        <w:t>Lectures tracked across 4 states (scheduled to cancelled) with present/absent marking and Zod-validated React/TanStack forms.</w:t>
       </w:r>
     </w:p>
     <w:p>
@@ -723,19 +616,8 @@
             <w:sz w:val="20"/>
             <w:szCs w:val="20"/>
           </w:rPr>
-          <w:t>github.com/harsh4k/</w:t>
+          <w:t>github.com/harsh4k/rudo</w:t>
         </w:r>
-        <w:proofErr w:type="spellStart"/>
-        <w:r>
-          <w:rPr>
-            <w:rStyle w:val="Hyperlink"/>
-            <w:rFonts w:asciiTheme="minorHAnsi" w:hAnsiTheme="minorHAnsi" w:cstheme="minorHAnsi"/>
-            <w:sz w:val="20"/>
-            <w:szCs w:val="20"/>
-          </w:rPr>
-          <w:t>rudo</w:t>
-        </w:r>
-        <w:proofErr w:type="spellEnd"/>
       </w:hyperlink>
     </w:p>
     <w:p>
@@ -756,29 +638,7 @@
           <w:sz w:val="20"/>
           <w:szCs w:val="20"/>
         </w:rPr>
-        <w:t xml:space="preserve">Local AI terminal assistant built around Gemma 3 via </w:t>
-      </w:r>
-      <w:proofErr w:type="spellStart"/>
-      <w:r>
-        <w:rPr>
-          <w:rFonts w:asciiTheme="minorHAnsi" w:hAnsiTheme="minorHAnsi" w:cstheme="minorHAnsi"/>
-          <w:i/>
-          <w:iCs/>
-          <w:sz w:val="20"/>
-          <w:szCs w:val="20"/>
-        </w:rPr>
-        <w:t>Ollama</w:t>
-      </w:r>
-      <w:proofErr w:type="spellEnd"/>
-      <w:r>
-        <w:rPr>
-          <w:rFonts w:asciiTheme="minorHAnsi" w:hAnsiTheme="minorHAnsi" w:cstheme="minorHAnsi"/>
-          <w:i/>
-          <w:iCs/>
-          <w:sz w:val="20"/>
-          <w:szCs w:val="20"/>
-        </w:rPr>
-        <w:t>.</w:t>
+        <w:t>Local AI terminal assistant built around Gemma 3 via Ollama.</w:t>
       </w:r>
     </w:p>
     <w:p>
@@ -1214,29 +1074,7 @@
           <w:sz w:val="20"/>
           <w:szCs w:val="20"/>
         </w:rPr>
-        <w:t xml:space="preserve">                </w:t>
-      </w:r>
-      <w:proofErr w:type="gramStart"/>
-      <w:r>
-        <w:rPr>
-          <w:rFonts w:asciiTheme="minorHAnsi" w:hAnsiTheme="minorHAnsi" w:cstheme="minorHAnsi"/>
-          <w:i/>
-          <w:iCs/>
-          <w:sz w:val="20"/>
-          <w:szCs w:val="20"/>
-        </w:rPr>
-        <w:t>B.TECH</w:t>
-      </w:r>
-      <w:proofErr w:type="gramEnd"/>
-      <w:r>
-        <w:rPr>
-          <w:rFonts w:asciiTheme="minorHAnsi" w:hAnsiTheme="minorHAnsi" w:cstheme="minorHAnsi"/>
-          <w:i/>
-          <w:iCs/>
-          <w:sz w:val="20"/>
-          <w:szCs w:val="20"/>
-        </w:rPr>
-        <w:t xml:space="preserve"> - Computer Engineering                                                                                                                                 CGPA - 7.72/10</w:t>
+        <w:t xml:space="preserve">                B.TECH - Computer Engineering                                                                                                                                 CGPA - 7.72/10</w:t>
       </w:r>
     </w:p>
     <w:p>
@@ -1292,26 +1130,14 @@
         </w:rPr>
         <w:t xml:space="preserve"> TypeScript, JavaScript, Python, Java, C, Rust, Node.js, React.js, Next.js, Express.js, Vite, Tailwind CSS, </w:t>
       </w:r>
-      <w:proofErr w:type="spellStart"/>
-      <w:proofErr w:type="gramStart"/>
-      <w:r>
-        <w:rPr>
-          <w:rFonts w:asciiTheme="minorHAnsi" w:hAnsiTheme="minorHAnsi" w:cstheme="minorHAnsi"/>
-          <w:sz w:val="20"/>
-          <w:szCs w:val="20"/>
-        </w:rPr>
-        <w:t>Tauri</w:t>
-      </w:r>
-      <w:r>
-        <w:rPr>
-          <w:rFonts w:asciiTheme="minorHAnsi" w:hAnsiTheme="minorHAnsi" w:cstheme="minorHAnsi"/>
-          <w:sz w:val="20"/>
-          <w:szCs w:val="20"/>
-        </w:rPr>
-        <w:t>,Tan</w:t>
-      </w:r>
-      <w:proofErr w:type="spellEnd"/>
-      <w:proofErr w:type="gramEnd"/>
+      <w:r>
+        <w:rPr>
+          <w:rFonts w:asciiTheme="minorHAnsi" w:hAnsiTheme="minorHAnsi" w:cstheme="minorHAnsi"/>
+          <w:sz w:val="20"/>
+          <w:szCs w:val="20"/>
+        </w:rPr>
+        <w:t>Tauri, Tan</w:t>
+      </w:r>
       <w:r>
         <w:rPr>
           <w:rFonts w:asciiTheme="minorHAnsi" w:hAnsiTheme="minorHAnsi" w:cstheme="minorHAnsi"/>
@@ -1320,26 +1146,14 @@
         </w:rPr>
         <w:t xml:space="preserve"> </w:t>
       </w:r>
-      <w:proofErr w:type="spellStart"/>
-      <w:proofErr w:type="gramStart"/>
-      <w:r>
-        <w:rPr>
-          <w:rFonts w:asciiTheme="minorHAnsi" w:hAnsiTheme="minorHAnsi" w:cstheme="minorHAnsi"/>
-          <w:sz w:val="20"/>
-          <w:szCs w:val="20"/>
-        </w:rPr>
-        <w:t>Stack,Bun</w:t>
-      </w:r>
-      <w:proofErr w:type="gramEnd"/>
-      <w:r>
-        <w:rPr>
-          <w:rFonts w:asciiTheme="minorHAnsi" w:hAnsiTheme="minorHAnsi" w:cstheme="minorHAnsi"/>
-          <w:sz w:val="20"/>
-          <w:szCs w:val="20"/>
-        </w:rPr>
-        <w:t>,Html</w:t>
-      </w:r>
-      <w:proofErr w:type="spellEnd"/>
+      <w:r>
+        <w:rPr>
+          <w:rFonts w:asciiTheme="minorHAnsi" w:hAnsiTheme="minorHAnsi" w:cstheme="minorHAnsi"/>
+          <w:sz w:val="20"/>
+          <w:szCs w:val="20"/>
+        </w:rPr>
+        <w:t>Stack, Bun, Html</w:t>
+      </w:r>
     </w:p>
     <w:p>
       <w:pPr>
@@ -1372,26 +1186,14 @@
         </w:rPr>
         <w:t xml:space="preserve"> PostgreSQL, MongoDB, </w:t>
       </w:r>
-      <w:proofErr w:type="spellStart"/>
-      <w:proofErr w:type="gramStart"/>
-      <w:r>
-        <w:rPr>
-          <w:rFonts w:asciiTheme="minorHAnsi" w:hAnsiTheme="minorHAnsi" w:cstheme="minorHAnsi"/>
-          <w:sz w:val="20"/>
-          <w:szCs w:val="20"/>
-        </w:rPr>
-        <w:t>Supabase</w:t>
-      </w:r>
-      <w:r>
-        <w:rPr>
-          <w:rFonts w:asciiTheme="minorHAnsi" w:hAnsiTheme="minorHAnsi" w:cstheme="minorHAnsi"/>
-          <w:sz w:val="20"/>
-          <w:szCs w:val="20"/>
-        </w:rPr>
-        <w:t>,VectorDB</w:t>
-      </w:r>
-      <w:proofErr w:type="spellEnd"/>
-      <w:proofErr w:type="gramEnd"/>
+      <w:r>
+        <w:rPr>
+          <w:rFonts w:asciiTheme="minorHAnsi" w:hAnsiTheme="minorHAnsi" w:cstheme="minorHAnsi"/>
+          <w:sz w:val="20"/>
+          <w:szCs w:val="20"/>
+        </w:rPr>
+        <w:t>Supabase, VectorDB</w:t>
+      </w:r>
     </w:p>
     <w:p>
       <w:pPr>
@@ -1422,25 +1224,7 @@
           <w:sz w:val="20"/>
           <w:szCs w:val="20"/>
         </w:rPr>
-        <w:t xml:space="preserve"> Docker, CI/CD, </w:t>
-      </w:r>
-      <w:proofErr w:type="spellStart"/>
-      <w:r>
-        <w:rPr>
-          <w:rFonts w:asciiTheme="minorHAnsi" w:hAnsiTheme="minorHAnsi" w:cstheme="minorHAnsi"/>
-          <w:sz w:val="20"/>
-          <w:szCs w:val="20"/>
-        </w:rPr>
-        <w:t>Vercel</w:t>
-      </w:r>
-      <w:proofErr w:type="spellEnd"/>
-      <w:r>
-        <w:rPr>
-          <w:rFonts w:asciiTheme="minorHAnsi" w:hAnsiTheme="minorHAnsi" w:cstheme="minorHAnsi"/>
-          <w:sz w:val="20"/>
-          <w:szCs w:val="20"/>
-        </w:rPr>
-        <w:t>, Sentry</w:t>
+        <w:t xml:space="preserve"> Docker, CI/CD, Vercel, Sentry</w:t>
       </w:r>
     </w:p>
     <w:p>
@@ -1568,43 +1352,7 @@
           <w:sz w:val="20"/>
           <w:szCs w:val="20"/>
         </w:rPr>
-        <w:t xml:space="preserve"> Local LLMs, </w:t>
-      </w:r>
-      <w:proofErr w:type="spellStart"/>
-      <w:r>
-        <w:rPr>
-          <w:rFonts w:asciiTheme="minorHAnsi" w:hAnsiTheme="minorHAnsi" w:cstheme="minorHAnsi"/>
-          <w:sz w:val="20"/>
-          <w:szCs w:val="20"/>
-        </w:rPr>
-        <w:t>Ollama</w:t>
-      </w:r>
-      <w:proofErr w:type="spellEnd"/>
-      <w:r>
-        <w:rPr>
-          <w:rFonts w:asciiTheme="minorHAnsi" w:hAnsiTheme="minorHAnsi" w:cstheme="minorHAnsi"/>
-          <w:sz w:val="20"/>
-          <w:szCs w:val="20"/>
-        </w:rPr>
-        <w:t xml:space="preserve">, Gemma, RAG, embeddings, CLIP, </w:t>
-      </w:r>
-      <w:proofErr w:type="spellStart"/>
-      <w:r>
-        <w:rPr>
-          <w:rFonts w:asciiTheme="minorHAnsi" w:hAnsiTheme="minorHAnsi" w:cstheme="minorHAnsi"/>
-          <w:sz w:val="20"/>
-          <w:szCs w:val="20"/>
-        </w:rPr>
-        <w:t>DeepGaze</w:t>
-      </w:r>
-      <w:proofErr w:type="spellEnd"/>
-      <w:r>
-        <w:rPr>
-          <w:rFonts w:asciiTheme="minorHAnsi" w:hAnsiTheme="minorHAnsi" w:cstheme="minorHAnsi"/>
-          <w:sz w:val="20"/>
-          <w:szCs w:val="20"/>
-        </w:rPr>
-        <w:t>, multimodal models</w:t>
+        <w:t xml:space="preserve"> Local LLMs, Ollama, Gemma, RAG, embeddings, CLIP, DeepGaze, multimodal models</w:t>
       </w:r>
     </w:p>
     <w:sectPr>

</xml_diff>